<commit_message>
docs: add Kakao channel connection procedure
</commit_message>
<xml_diff>
--- a/docs/manual/dist/CGA 사용자 설명서.docx
+++ b/docs/manual/dist/CGA 사용자 설명서.docx
@@ -2414,6 +2414,832 @@
           <w:sz w:val="21"/>
         </w:rPr>
         <w:t>관리자 메뉴의 권한별 세부 동작은 실제 역할별 브라우저 검증 후 확정합니다.</w:t>
+      </w:r>
+    </w:p>
+    <w:p>
+      <w:pPr>
+        <w:pStyle w:val="Heading2"/>
+      </w:pPr>
+      <w:r>
+        <w:rPr>
+          <w:rFonts w:ascii="Malgun Gothic" w:hAnsi="Malgun Gothic" w:eastAsia="Malgun Gothic"/>
+          <w:b/>
+          <w:i w:val="0"/>
+          <w:sz w:val="21"/>
+        </w:rPr>
+        <w:t>6.2 카카오톡 채널 연결</w:t>
+      </w:r>
+    </w:p>
+    <w:p>
+      <w:r>
+        <w:rPr>
+          <w:rFonts w:ascii="Malgun Gothic" w:hAnsi="Malgun Gothic" w:eastAsia="Malgun Gothic"/>
+          <w:b w:val="0"/>
+          <w:i w:val="0"/>
+          <w:sz w:val="21"/>
+        </w:rPr>
+        <w:t>카카오톡 연결은 카카오 개발자 설정, 카카오톡 채널·챗봇 설정, CGA 연결 정보 설정을 순서대로 완료해야 합니다. CGA 화면에서 채널을 등록하는 작업만으로 카카오톡 연결이 완료되는 것은 아닙니다.</w:t>
+      </w:r>
+    </w:p>
+    <w:p>
+      <w:pPr>
+        <w:spacing w:before="80" w:after="160"/>
+        <w:ind w:left="288" w:right="288"/>
+      </w:pPr>
+      <w:r>
+        <w:rPr>
+          <w:rFonts w:ascii="Malgun Gothic" w:hAnsi="Malgun Gothic" w:eastAsia="Malgun Gothic"/>
+          <w:i/>
+          <w:color w:val="5F6368"/>
+          <w:sz w:val="19"/>
+        </w:rPr>
+        <w:t>보안 주의: 앱 ID, REST API 키, Skill URL, 운영·테스트 헤더와 같은 인증·연결 정보는 문서, 화면 캡처, 로그, 메신저에 실제 값으로 기록하지 않습니다. 실제 값은 운영 담당자가 안전한 전달 경로로 확인하고, 문서에는 항목명과 저장 위치만 기록합니다.</w:t>
+      </w:r>
+    </w:p>
+    <w:p>
+      <w:pPr>
+        <w:pStyle w:val="Heading3"/>
+      </w:pPr>
+      <w:r>
+        <w:rPr>
+          <w:rFonts w:ascii="Malgun Gothic" w:hAnsi="Malgun Gothic" w:eastAsia="Malgun Gothic"/>
+          <w:b/>
+          <w:i w:val="0"/>
+          <w:sz w:val="21"/>
+        </w:rPr>
+        <w:t>6.2.1 사전 준비</w:t>
+      </w:r>
+    </w:p>
+    <w:p>
+      <w:r>
+        <w:rPr>
+          <w:rFonts w:ascii="Malgun Gothic" w:hAnsi="Malgun Gothic" w:eastAsia="Malgun Gothic"/>
+          <w:b w:val="0"/>
+          <w:i w:val="0"/>
+          <w:sz w:val="21"/>
+        </w:rPr>
+        <w:t>다음 정보를 운영 담당자에게 확인합니다.</w:t>
+      </w:r>
+    </w:p>
+    <w:p>
+      <w:pPr>
+        <w:pStyle w:val="ListBullet"/>
+        <w:spacing w:after="80"/>
+      </w:pPr>
+      <w:r>
+        <w:rPr>
+          <w:rFonts w:ascii="Malgun Gothic" w:hAnsi="Malgun Gothic" w:eastAsia="Malgun Gothic"/>
+          <w:sz w:val="21"/>
+        </w:rPr>
+        <w:t>Kakao Developers 앱과 앱 ID</w:t>
+      </w:r>
+    </w:p>
+    <w:p>
+      <w:pPr>
+        <w:pStyle w:val="ListBullet"/>
+        <w:spacing w:after="80"/>
+      </w:pPr>
+      <w:r>
+        <w:rPr>
+          <w:rFonts w:ascii="Malgun Gothic" w:hAnsi="Malgun Gothic" w:eastAsia="Malgun Gothic"/>
+          <w:sz w:val="21"/>
+        </w:rPr>
+        <w:t>카카오톡 채널 및 비즈니스 채널 연결 상태</w:t>
+      </w:r>
+    </w:p>
+    <w:p>
+      <w:pPr>
+        <w:pStyle w:val="ListBullet"/>
+        <w:spacing w:after="80"/>
+      </w:pPr>
+      <w:r>
+        <w:rPr>
+          <w:rFonts w:ascii="Malgun Gothic" w:hAnsi="Malgun Gothic" w:eastAsia="Malgun Gothic"/>
+          <w:sz w:val="21"/>
+        </w:rPr>
+        <w:t>카카오비즈니스 챗봇과 운영 채널</w:t>
+      </w:r>
+    </w:p>
+    <w:p>
+      <w:pPr>
+        <w:pStyle w:val="ListBullet"/>
+        <w:spacing w:after="80"/>
+      </w:pPr>
+      <w:r>
+        <w:rPr>
+          <w:rFonts w:ascii="Malgun Gothic" w:hAnsi="Malgun Gothic" w:eastAsia="Malgun Gothic"/>
+          <w:sz w:val="21"/>
+        </w:rPr>
+        <w:t>CGA에서 사용할 봇과 운영 버전</w:t>
+      </w:r>
+    </w:p>
+    <w:p>
+      <w:pPr>
+        <w:pStyle w:val="ListBullet"/>
+        <w:spacing w:after="80"/>
+      </w:pPr>
+      <w:r>
+        <w:rPr>
+          <w:rFonts w:ascii="Malgun Gothic" w:hAnsi="Malgun Gothic" w:eastAsia="Malgun Gothic"/>
+          <w:sz w:val="21"/>
+        </w:rPr>
+        <w:t>CGA가 발급한 Skill URL과 Test URL</w:t>
+      </w:r>
+    </w:p>
+    <w:p>
+      <w:pPr>
+        <w:pStyle w:val="ListBullet"/>
+        <w:spacing w:after="80"/>
+      </w:pPr>
+      <w:r>
+        <w:rPr>
+          <w:rFonts w:ascii="Malgun Gothic" w:hAnsi="Malgun Gothic" w:eastAsia="Malgun Gothic"/>
+          <w:sz w:val="21"/>
+        </w:rPr>
+        <w:t>필요한 운영 헤더와 테스트 헤더</w:t>
+      </w:r>
+    </w:p>
+    <w:p>
+      <w:r>
+        <w:rPr>
+          <w:rFonts w:ascii="Malgun Gothic" w:hAnsi="Malgun Gothic" w:eastAsia="Malgun Gothic"/>
+          <w:b w:val="0"/>
+          <w:i w:val="0"/>
+          <w:sz w:val="21"/>
+        </w:rPr>
+        <w:t>앱 ID나 키가 문서·화면에 하드코딩되어 있거나, 운영 봇과 테스트 봇의 버전이 다르면 연결 확인을 진행하지 않습니다.</w:t>
+      </w:r>
+    </w:p>
+    <w:p>
+      <w:pPr>
+        <w:pStyle w:val="Heading3"/>
+      </w:pPr>
+      <w:r>
+        <w:rPr>
+          <w:rFonts w:ascii="Malgun Gothic" w:hAnsi="Malgun Gothic" w:eastAsia="Malgun Gothic"/>
+          <w:b/>
+          <w:i w:val="0"/>
+          <w:sz w:val="21"/>
+        </w:rPr>
+        <w:t>6.2.2 Kakao Developers 앱 설정</w:t>
+      </w:r>
+    </w:p>
+    <w:p>
+      <w:pPr>
+        <w:pStyle w:val="ListNumber"/>
+        <w:spacing w:after="80"/>
+      </w:pPr>
+      <w:r>
+        <w:rPr>
+          <w:rFonts w:ascii="Malgun Gothic" w:hAnsi="Malgun Gothic" w:eastAsia="Malgun Gothic"/>
+          <w:sz w:val="21"/>
+        </w:rPr>
+        <w:t>[Kakao Developers](https://developers.kakao.com/)에 로그인합니다.</w:t>
+      </w:r>
+    </w:p>
+    <w:p>
+      <w:pPr>
+        <w:pStyle w:val="ListNumber"/>
+        <w:spacing w:after="80"/>
+      </w:pPr>
+      <w:r>
+        <w:rPr>
+          <w:rFonts w:ascii="Malgun Gothic" w:hAnsi="Malgun Gothic" w:eastAsia="Malgun Gothic"/>
+          <w:sz w:val="21"/>
+        </w:rPr>
+        <w:t>**앱** 메뉴에서 연결할 앱을 선택합니다.</w:t>
+      </w:r>
+    </w:p>
+    <w:p>
+      <w:pPr>
+        <w:pStyle w:val="ListNumber"/>
+        <w:spacing w:after="80"/>
+      </w:pPr>
+      <w:r>
+        <w:rPr>
+          <w:rFonts w:ascii="Malgun Gothic" w:hAnsi="Malgun Gothic" w:eastAsia="Malgun Gothic"/>
+          <w:sz w:val="21"/>
+        </w:rPr>
+        <w:t>앱 이름과 앱 ID를 확인합니다.</w:t>
+      </w:r>
+    </w:p>
+    <w:p>
+      <w:pPr>
+        <w:pStyle w:val="ListNumber"/>
+        <w:spacing w:after="80"/>
+      </w:pPr>
+      <w:r>
+        <w:rPr>
+          <w:rFonts w:ascii="Malgun Gothic" w:hAnsi="Malgun Gothic" w:eastAsia="Malgun Gothic"/>
+          <w:sz w:val="21"/>
+        </w:rPr>
+        <w:t>**카카오 로그인 &gt; 일반**에서 카카오 로그인이 필요한 경우 상태를 `ON`으로 설정하고 저장합니다.</w:t>
+      </w:r>
+    </w:p>
+    <w:p>
+      <w:pPr>
+        <w:pStyle w:val="ListNumber"/>
+        <w:spacing w:after="80"/>
+      </w:pPr>
+      <w:r>
+        <w:rPr>
+          <w:rFonts w:ascii="Malgun Gothic" w:hAnsi="Malgun Gothic" w:eastAsia="Malgun Gothic"/>
+          <w:sz w:val="21"/>
+        </w:rPr>
+        <w:t>**비즈니스 인증 &gt; 비즈 앱 전환**에서 앱 기본 정보와 비즈 앱 전환 상태를 확인합니다.</w:t>
+      </w:r>
+    </w:p>
+    <w:p>
+      <w:pPr>
+        <w:pStyle w:val="ListNumber"/>
+        <w:spacing w:after="80"/>
+      </w:pPr>
+      <w:r>
+        <w:rPr>
+          <w:rFonts w:ascii="Malgun Gothic" w:hAnsi="Malgun Gothic" w:eastAsia="Malgun Gothic"/>
+          <w:sz w:val="21"/>
+        </w:rPr>
+        <w:t>**카카오톡 채널 &gt; 비즈니스 채널 연결**에서 신청 자격과 심사 상태를 확인합니다.</w:t>
+      </w:r>
+    </w:p>
+    <w:p>
+      <w:pPr>
+        <w:pStyle w:val="ListNumber"/>
+        <w:spacing w:after="80"/>
+      </w:pPr>
+      <w:r>
+        <w:rPr>
+          <w:rFonts w:ascii="Malgun Gothic" w:hAnsi="Malgun Gothic" w:eastAsia="Malgun Gothic"/>
+          <w:sz w:val="21"/>
+        </w:rPr>
+        <w:t>앱 설정에서 REST API 키를 확인하되, 실제 키 값은 외부에 노출하지 않습니다.</w:t>
+      </w:r>
+    </w:p>
+    <w:p>
+      <w:r>
+        <w:rPr>
+          <w:rFonts w:ascii="Malgun Gothic" w:hAnsi="Malgun Gothic" w:eastAsia="Malgun Gothic"/>
+          <w:b w:val="0"/>
+          <w:i w:val="0"/>
+          <w:sz w:val="21"/>
+        </w:rPr>
+        <w:t>비즈니스 채널 연결은 심사 상태에 따라 바로 사용할 수 없을 수 있습니다. 심사 중인 경우 연결 완료로 판단하지 말고 상태를 기록합니다.</w:t>
+      </w:r>
+    </w:p>
+    <w:p>
+      <w:pPr>
+        <w:pStyle w:val="Heading3"/>
+      </w:pPr>
+      <w:r>
+        <w:rPr>
+          <w:rFonts w:ascii="Malgun Gothic" w:hAnsi="Malgun Gothic" w:eastAsia="Malgun Gothic"/>
+          <w:b/>
+          <w:i w:val="0"/>
+          <w:sz w:val="21"/>
+        </w:rPr>
+        <w:t>6.2.3 카카오톡 채널과 챗봇 설정</w:t>
+      </w:r>
+    </w:p>
+    <w:p>
+      <w:pPr>
+        <w:pStyle w:val="ListNumber"/>
+        <w:spacing w:after="80"/>
+      </w:pPr>
+      <w:r>
+        <w:rPr>
+          <w:rFonts w:ascii="Malgun Gothic" w:hAnsi="Malgun Gothic" w:eastAsia="Malgun Gothic"/>
+          <w:sz w:val="21"/>
+        </w:rPr>
+        <w:t>[카카오톡 채널 관리자센터](https://center-pf.kakao.com/) 또는 카카오비즈니스 관리센터에서 연결할 채널을 확인합니다.</w:t>
+      </w:r>
+    </w:p>
+    <w:p>
+      <w:pPr>
+        <w:pStyle w:val="ListNumber"/>
+        <w:spacing w:after="80"/>
+      </w:pPr>
+      <w:r>
+        <w:rPr>
+          <w:rFonts w:ascii="Malgun Gothic" w:hAnsi="Malgun Gothic" w:eastAsia="Malgun Gothic"/>
+          <w:sz w:val="21"/>
+        </w:rPr>
+        <w:t>채널이 검색 가능하고 사용 가능한 상태인지 확인합니다.</w:t>
+      </w:r>
+    </w:p>
+    <w:p>
+      <w:pPr>
+        <w:pStyle w:val="ListNumber"/>
+        <w:spacing w:after="80"/>
+      </w:pPr>
+      <w:r>
+        <w:rPr>
+          <w:rFonts w:ascii="Malgun Gothic" w:hAnsi="Malgun Gothic" w:eastAsia="Malgun Gothic"/>
+          <w:sz w:val="21"/>
+        </w:rPr>
+        <w:t>**비즈니스 도구 &gt; 챗봇**에서 챗봇을 생성하거나 기존 챗봇을 선택합니다.</w:t>
+      </w:r>
+    </w:p>
+    <w:p>
+      <w:pPr>
+        <w:pStyle w:val="ListNumber"/>
+        <w:spacing w:after="80"/>
+      </w:pPr>
+      <w:r>
+        <w:rPr>
+          <w:rFonts w:ascii="Malgun Gothic" w:hAnsi="Malgun Gothic" w:eastAsia="Malgun Gothic"/>
+          <w:sz w:val="21"/>
+        </w:rPr>
+        <w:t>챗봇의 **설정 &gt; 운영 채널 선택하기**에서 CGA와 연결할 운영 채널을 선택하고 저장합니다.</w:t>
+      </w:r>
+    </w:p>
+    <w:p>
+      <w:pPr>
+        <w:pStyle w:val="ListNumber"/>
+        <w:spacing w:after="80"/>
+      </w:pPr>
+      <w:r>
+        <w:rPr>
+          <w:rFonts w:ascii="Malgun Gothic" w:hAnsi="Malgun Gothic" w:eastAsia="Malgun Gothic"/>
+          <w:sz w:val="21"/>
+        </w:rPr>
+        <w:t>채널 대시보드의 **챗봇 연결하기**에서 운영 채널과 챗봇이 연결되었는지 확인합니다.</w:t>
+      </w:r>
+    </w:p>
+    <w:p>
+      <w:pPr>
+        <w:pStyle w:val="Heading3"/>
+      </w:pPr>
+      <w:r>
+        <w:rPr>
+          <w:rFonts w:ascii="Malgun Gothic" w:hAnsi="Malgun Gothic" w:eastAsia="Malgun Gothic"/>
+          <w:b/>
+          <w:i w:val="0"/>
+          <w:sz w:val="21"/>
+        </w:rPr>
+        <w:t>6.2.4 Skill 생성과 연결 정보 입력</w:t>
+      </w:r>
+    </w:p>
+    <w:p>
+      <w:pPr>
+        <w:pStyle w:val="ListNumber"/>
+        <w:spacing w:after="80"/>
+      </w:pPr>
+      <w:r>
+        <w:rPr>
+          <w:rFonts w:ascii="Malgun Gothic" w:hAnsi="Malgun Gothic" w:eastAsia="Malgun Gothic"/>
+          <w:sz w:val="21"/>
+        </w:rPr>
+        <w:t>카카오 챗봇 관리자센터에서 대상 챗봇을 선택합니다.</w:t>
+      </w:r>
+    </w:p>
+    <w:p>
+      <w:pPr>
+        <w:pStyle w:val="ListNumber"/>
+        <w:spacing w:after="80"/>
+      </w:pPr>
+      <w:r>
+        <w:rPr>
+          <w:rFonts w:ascii="Malgun Gothic" w:hAnsi="Malgun Gothic" w:eastAsia="Malgun Gothic"/>
+          <w:sz w:val="21"/>
+        </w:rPr>
+        <w:t>**새 블록 만들기 &gt; 스킬 생성**을 선택합니다.</w:t>
+      </w:r>
+    </w:p>
+    <w:p>
+      <w:pPr>
+        <w:pStyle w:val="ListNumber"/>
+        <w:spacing w:after="80"/>
+      </w:pPr>
+      <w:r>
+        <w:rPr>
+          <w:rFonts w:ascii="Malgun Gothic" w:hAnsi="Malgun Gothic" w:eastAsia="Malgun Gothic"/>
+          <w:sz w:val="21"/>
+        </w:rPr>
+        <w:t>Skill 이름을 입력합니다. 운영 규칙에 따라 이름을 지정하고, CGA 연결용 Skill임을 식별할 수 있게 합니다.</w:t>
+      </w:r>
+    </w:p>
+    <w:p>
+      <w:pPr>
+        <w:pStyle w:val="ListNumber"/>
+        <w:spacing w:after="80"/>
+      </w:pPr>
+      <w:r>
+        <w:rPr>
+          <w:rFonts w:ascii="Malgun Gothic" w:hAnsi="Malgun Gothic" w:eastAsia="Malgun Gothic"/>
+          <w:sz w:val="21"/>
+        </w:rPr>
+        <w:t>CGA에서 발급한 Skill URL과 Test URL을 각각 입력합니다.</w:t>
+      </w:r>
+    </w:p>
+    <w:p>
+      <w:pPr>
+        <w:pStyle w:val="ListNumber"/>
+        <w:spacing w:after="80"/>
+      </w:pPr>
+      <w:r>
+        <w:rPr>
+          <w:rFonts w:ascii="Malgun Gothic" w:hAnsi="Malgun Gothic" w:eastAsia="Malgun Gothic"/>
+          <w:sz w:val="21"/>
+        </w:rPr>
+        <w:t>필요한 경우 운영 헤더와 테스트 헤더를 각각 입력합니다.</w:t>
+      </w:r>
+    </w:p>
+    <w:p>
+      <w:pPr>
+        <w:pStyle w:val="ListNumber"/>
+        <w:spacing w:after="80"/>
+      </w:pPr>
+      <w:r>
+        <w:rPr>
+          <w:rFonts w:ascii="Malgun Gothic" w:hAnsi="Malgun Gothic" w:eastAsia="Malgun Gothic"/>
+          <w:sz w:val="21"/>
+        </w:rPr>
+        <w:t>저장 후 Skill 상세 화면에서 URL, Test URL, 헤더 입력 상태와 적용 가능한 블록을 확인합니다.</w:t>
+      </w:r>
+    </w:p>
+    <w:p>
+      <w:r>
+        <w:rPr>
+          <w:rFonts w:ascii="Malgun Gothic" w:hAnsi="Malgun Gothic" w:eastAsia="Malgun Gothic"/>
+          <w:b w:val="0"/>
+          <w:i w:val="0"/>
+          <w:sz w:val="21"/>
+        </w:rPr>
+        <w:t>Skill URL과 헤더는 CGA 운영 담당자가 제공한 값을 사용합니다. 값을 추측하거나 운영 URL과 테스트 URL을 바꾸어 입력하지 않습니다.</w:t>
+      </w:r>
+    </w:p>
+    <w:p>
+      <w:pPr>
+        <w:pStyle w:val="Heading3"/>
+      </w:pPr>
+      <w:r>
+        <w:rPr>
+          <w:rFonts w:ascii="Malgun Gothic" w:hAnsi="Malgun Gothic" w:eastAsia="Malgun Gothic"/>
+          <w:b/>
+          <w:i w:val="0"/>
+          <w:sz w:val="21"/>
+        </w:rPr>
+        <w:t>6.2.5 웰컴 블록과 폴백 블록 연결</w:t>
+      </w:r>
+    </w:p>
+    <w:p>
+      <w:pPr>
+        <w:pStyle w:val="ListNumber"/>
+        <w:spacing w:after="80"/>
+      </w:pPr>
+      <w:r>
+        <w:rPr>
+          <w:rFonts w:ascii="Malgun Gothic" w:hAnsi="Malgun Gothic" w:eastAsia="Malgun Gothic"/>
+          <w:sz w:val="21"/>
+        </w:rPr>
+        <w:t>챗봇의 웰컴 블록을 엽니다.</w:t>
+      </w:r>
+    </w:p>
+    <w:p>
+      <w:pPr>
+        <w:pStyle w:val="ListNumber"/>
+        <w:spacing w:after="80"/>
+      </w:pPr>
+      <w:r>
+        <w:rPr>
+          <w:rFonts w:ascii="Malgun Gothic" w:hAnsi="Malgun Gothic" w:eastAsia="Malgun Gothic"/>
+          <w:sz w:val="21"/>
+        </w:rPr>
+        <w:t>**파라미터 설정**에서 CGA 연결 Skill을 선택합니다.</w:t>
+      </w:r>
+    </w:p>
+    <w:p>
+      <w:pPr>
+        <w:pStyle w:val="ListNumber"/>
+        <w:spacing w:after="80"/>
+      </w:pPr>
+      <w:r>
+        <w:rPr>
+          <w:rFonts w:ascii="Malgun Gothic" w:hAnsi="Malgun Gothic" w:eastAsia="Malgun Gothic"/>
+          <w:sz w:val="21"/>
+        </w:rPr>
+        <w:t>봇 응답 설정에서 **스킬데이터 사용**을 선택합니다.</w:t>
+      </w:r>
+    </w:p>
+    <w:p>
+      <w:pPr>
+        <w:pStyle w:val="ListNumber"/>
+        <w:spacing w:after="80"/>
+      </w:pPr>
+      <w:r>
+        <w:rPr>
+          <w:rFonts w:ascii="Malgun Gothic" w:hAnsi="Malgun Gothic" w:eastAsia="Malgun Gothic"/>
+          <w:sz w:val="21"/>
+        </w:rPr>
+        <w:t>저장합니다.</w:t>
+      </w:r>
+    </w:p>
+    <w:p>
+      <w:pPr>
+        <w:pStyle w:val="ListNumber"/>
+        <w:spacing w:after="80"/>
+      </w:pPr>
+      <w:r>
+        <w:rPr>
+          <w:rFonts w:ascii="Malgun Gothic" w:hAnsi="Malgun Gothic" w:eastAsia="Malgun Gothic"/>
+          <w:sz w:val="21"/>
+        </w:rPr>
+        <w:t>폴백 블록에서도 같은 CGA 연결 Skill과 **스킬데이터 사용**을 설정합니다.</w:t>
+      </w:r>
+    </w:p>
+    <w:p>
+      <w:pPr>
+        <w:pStyle w:val="ListNumber"/>
+        <w:spacing w:after="80"/>
+      </w:pPr>
+      <w:r>
+        <w:rPr>
+          <w:rFonts w:ascii="Malgun Gothic" w:hAnsi="Malgun Gothic" w:eastAsia="Malgun Gothic"/>
+          <w:sz w:val="21"/>
+        </w:rPr>
+        <w:t>저장 결과와 블록별 연결 상태를 다시 확인합니다.</w:t>
+      </w:r>
+    </w:p>
+    <w:p>
+      <w:r>
+        <w:rPr>
+          <w:rFonts w:ascii="Malgun Gothic" w:hAnsi="Malgun Gothic" w:eastAsia="Malgun Gothic"/>
+          <w:b w:val="0"/>
+          <w:i w:val="0"/>
+          <w:sz w:val="21"/>
+        </w:rPr>
+        <w:t>웰컴 블록은 카카오톡 대화의 첫 진입을 처리하고, 폴백 블록은 일반 발화를 CGA로 전달합니다. 두 블록이 서로 다른 Skill이나 다른 운영 버전을 사용하면 첫 인사말과 일반 응답의 처리 결과가 달라질 수 있습니다.</w:t>
+      </w:r>
+    </w:p>
+    <w:p>
+      <w:pPr>
+        <w:pStyle w:val="Heading3"/>
+      </w:pPr>
+      <w:r>
+        <w:rPr>
+          <w:rFonts w:ascii="Malgun Gothic" w:hAnsi="Malgun Gothic" w:eastAsia="Malgun Gothic"/>
+          <w:b/>
+          <w:i w:val="0"/>
+          <w:sz w:val="21"/>
+        </w:rPr>
+        <w:t>6.2.6 CGA 채널 등록과 운영 버전 연결</w:t>
+      </w:r>
+    </w:p>
+    <w:p>
+      <w:pPr>
+        <w:pStyle w:val="ListNumber"/>
+        <w:spacing w:after="80"/>
+      </w:pPr>
+      <w:r>
+        <w:rPr>
+          <w:rFonts w:ascii="Malgun Gothic" w:hAnsi="Malgun Gothic" w:eastAsia="Malgun Gothic"/>
+          <w:sz w:val="21"/>
+        </w:rPr>
+        <w:t>CGA Studio에서 **시스템 관리 &gt; 채널 관리**로 이동합니다.</w:t>
+      </w:r>
+    </w:p>
+    <w:p>
+      <w:pPr>
+        <w:pStyle w:val="ListNumber"/>
+        <w:spacing w:after="80"/>
+      </w:pPr>
+      <w:r>
+        <w:rPr>
+          <w:rFonts w:ascii="Malgun Gothic" w:hAnsi="Malgun Gothic" w:eastAsia="Malgun Gothic"/>
+          <w:sz w:val="21"/>
+        </w:rPr>
+        <w:t>카카오톡 연계에 사용할 채널 아이디와 채널 이름을 입력하거나 기존 채널을 선택합니다.</w:t>
+      </w:r>
+    </w:p>
+    <w:p>
+      <w:pPr>
+        <w:pStyle w:val="ListNumber"/>
+        <w:spacing w:after="80"/>
+      </w:pPr>
+      <w:r>
+        <w:rPr>
+          <w:rFonts w:ascii="Malgun Gothic" w:hAnsi="Malgun Gothic" w:eastAsia="Malgun Gothic"/>
+          <w:sz w:val="21"/>
+        </w:rPr>
+        <w:t>Provider, 렌더러 타입, 사용 여부와 연결 설정을 확인합니다.</w:t>
+      </w:r>
+    </w:p>
+    <w:p>
+      <w:pPr>
+        <w:pStyle w:val="ListNumber"/>
+        <w:spacing w:after="80"/>
+      </w:pPr>
+      <w:r>
+        <w:rPr>
+          <w:rFonts w:ascii="Malgun Gothic" w:hAnsi="Malgun Gothic" w:eastAsia="Malgun Gothic"/>
+          <w:sz w:val="21"/>
+        </w:rPr>
+        <w:t>연결 대상 봇과 운영 버전을 확인합니다.</w:t>
+      </w:r>
+    </w:p>
+    <w:p>
+      <w:pPr>
+        <w:pStyle w:val="ListNumber"/>
+        <w:spacing w:after="80"/>
+      </w:pPr>
+      <w:r>
+        <w:rPr>
+          <w:rFonts w:ascii="Malgun Gothic" w:hAnsi="Malgun Gothic" w:eastAsia="Malgun Gothic"/>
+          <w:sz w:val="21"/>
+        </w:rPr>
+        <w:t>저장 후 채널 관리 화면의 연결 상태를 확인합니다.</w:t>
+      </w:r>
+    </w:p>
+    <w:p>
+      <w:pPr>
+        <w:pStyle w:val="ListNumber"/>
+        <w:spacing w:after="80"/>
+      </w:pPr>
+      <w:r>
+        <w:rPr>
+          <w:rFonts w:ascii="Malgun Gothic" w:hAnsi="Malgun Gothic" w:eastAsia="Malgun Gothic"/>
+          <w:sz w:val="21"/>
+        </w:rPr>
+        <w:t>**봇스테이션 연계 현황**에서 그룹·채널·봇·운영 버전·활성 채널의 조합이 올바른지 확인합니다.</w:t>
+      </w:r>
+    </w:p>
+    <w:p>
+      <w:pPr>
+        <w:pStyle w:val="Heading3"/>
+      </w:pPr>
+      <w:r>
+        <w:rPr>
+          <w:rFonts w:ascii="Malgun Gothic" w:hAnsi="Malgun Gothic" w:eastAsia="Malgun Gothic"/>
+          <w:b/>
+          <w:i w:val="0"/>
+          <w:sz w:val="21"/>
+        </w:rPr>
+        <w:t>6.2.7 연결 확인</w:t>
+      </w:r>
+    </w:p>
+    <w:p>
+      <w:pPr>
+        <w:pStyle w:val="ListNumber"/>
+        <w:spacing w:after="80"/>
+      </w:pPr>
+      <w:r>
+        <w:rPr>
+          <w:rFonts w:ascii="Malgun Gothic" w:hAnsi="Malgun Gothic" w:eastAsia="Malgun Gothic"/>
+          <w:sz w:val="21"/>
+        </w:rPr>
+        <w:t>카카오톡에서 연결한 채널을 검색해 대화방을 엽니다.</w:t>
+      </w:r>
+    </w:p>
+    <w:p>
+      <w:pPr>
+        <w:pStyle w:val="ListNumber"/>
+        <w:spacing w:after="80"/>
+      </w:pPr>
+      <w:r>
+        <w:rPr>
+          <w:rFonts w:ascii="Malgun Gothic" w:hAnsi="Malgun Gothic" w:eastAsia="Malgun Gothic"/>
+          <w:sz w:val="21"/>
+        </w:rPr>
+        <w:t>첫 진입 시 CGA의 기본 인사말이 표시되는지 확인합니다.</w:t>
+      </w:r>
+    </w:p>
+    <w:p>
+      <w:pPr>
+        <w:pStyle w:val="ListNumber"/>
+        <w:spacing w:after="80"/>
+      </w:pPr>
+      <w:r>
+        <w:rPr>
+          <w:rFonts w:ascii="Malgun Gothic" w:hAnsi="Malgun Gothic" w:eastAsia="Malgun Gothic"/>
+          <w:sz w:val="21"/>
+        </w:rPr>
+        <w:t>등록된 의도에 해당하는 일반 발화를 입력합니다.</w:t>
+      </w:r>
+    </w:p>
+    <w:p>
+      <w:pPr>
+        <w:pStyle w:val="ListNumber"/>
+        <w:spacing w:after="80"/>
+      </w:pPr>
+      <w:r>
+        <w:rPr>
+          <w:rFonts w:ascii="Malgun Gothic" w:hAnsi="Malgun Gothic" w:eastAsia="Malgun Gothic"/>
+          <w:sz w:val="21"/>
+        </w:rPr>
+        <w:t>CGA의 NLU 분류와 대화 흐름 결과가 응답으로 표시되는지 확인합니다.</w:t>
+      </w:r>
+    </w:p>
+    <w:p>
+      <w:pPr>
+        <w:pStyle w:val="ListNumber"/>
+        <w:spacing w:after="80"/>
+      </w:pPr>
+      <w:r>
+        <w:rPr>
+          <w:rFonts w:ascii="Malgun Gothic" w:hAnsi="Malgun Gothic" w:eastAsia="Malgun Gothic"/>
+          <w:sz w:val="21"/>
+        </w:rPr>
+        <w:t>CGA 대화 이력에서 사용자 발화와 응답이 저장되었는지 확인합니다.</w:t>
+      </w:r>
+    </w:p>
+    <w:p>
+      <w:pPr>
+        <w:pStyle w:val="ListNumber"/>
+        <w:spacing w:after="80"/>
+      </w:pPr>
+      <w:r>
+        <w:rPr>
+          <w:rFonts w:ascii="Malgun Gothic" w:hAnsi="Malgun Gothic" w:eastAsia="Malgun Gothic"/>
+          <w:sz w:val="21"/>
+        </w:rPr>
+        <w:t>이력의 채널 값이 `Kakao` 또는 운영 환경에서 정의한 카카오 채널 값인지 확인합니다.</w:t>
+      </w:r>
+    </w:p>
+    <w:p>
+      <w:pPr>
+        <w:pStyle w:val="ListNumber"/>
+        <w:spacing w:after="80"/>
+      </w:pPr>
+      <w:r>
+        <w:rPr>
+          <w:rFonts w:ascii="Malgun Gothic" w:hAnsi="Malgun Gothic" w:eastAsia="Malgun Gothic"/>
+          <w:sz w:val="21"/>
+        </w:rPr>
+        <w:t>봇, 운영 버전, 채널 정보가 의도한 대상과 일치하는지 확인합니다.</w:t>
+      </w:r>
+    </w:p>
+    <w:p>
+      <w:r>
+        <w:rPr>
+          <w:rFonts w:ascii="Malgun Gothic" w:hAnsi="Malgun Gothic" w:eastAsia="Malgun Gothic"/>
+          <w:b w:val="0"/>
+          <w:i w:val="0"/>
+          <w:sz w:val="21"/>
+        </w:rPr>
+        <w:t>연결 완료 조건은 다음과 같습니다.</w:t>
+      </w:r>
+    </w:p>
+    <w:p>
+      <w:pPr>
+        <w:pStyle w:val="ListBullet"/>
+        <w:spacing w:after="80"/>
+      </w:pPr>
+      <w:r>
+        <w:rPr>
+          <w:rFonts w:ascii="Malgun Gothic" w:hAnsi="Malgun Gothic" w:eastAsia="Malgun Gothic"/>
+          <w:sz w:val="21"/>
+        </w:rPr>
+        <w:t>웰컴 블록과 폴백 블록이 CGA 연결 Skill을 호출합니다.</w:t>
+      </w:r>
+    </w:p>
+    <w:p>
+      <w:pPr>
+        <w:pStyle w:val="ListBullet"/>
+        <w:spacing w:after="80"/>
+      </w:pPr>
+      <w:r>
+        <w:rPr>
+          <w:rFonts w:ascii="Malgun Gothic" w:hAnsi="Malgun Gothic" w:eastAsia="Malgun Gothic"/>
+          <w:sz w:val="21"/>
+        </w:rPr>
+        <w:t>두 블록 모두 스킬데이터 사용으로 설정되어 있습니다.</w:t>
+      </w:r>
+    </w:p>
+    <w:p>
+      <w:pPr>
+        <w:pStyle w:val="ListBullet"/>
+        <w:spacing w:after="80"/>
+      </w:pPr>
+      <w:r>
+        <w:rPr>
+          <w:rFonts w:ascii="Malgun Gothic" w:hAnsi="Malgun Gothic" w:eastAsia="Malgun Gothic"/>
+          <w:sz w:val="21"/>
+        </w:rPr>
+        <w:t>첫 인사말과 일반 응답이 카카오 설정 문구가 아니라 CGA 봇 설정에서 나옵니다.</w:t>
+      </w:r>
+    </w:p>
+    <w:p>
+      <w:pPr>
+        <w:pStyle w:val="ListBullet"/>
+        <w:spacing w:after="80"/>
+      </w:pPr>
+      <w:r>
+        <w:rPr>
+          <w:rFonts w:ascii="Malgun Gothic" w:hAnsi="Malgun Gothic" w:eastAsia="Malgun Gothic"/>
+          <w:sz w:val="21"/>
+        </w:rPr>
+        <w:t>CGA 대화 이력에 봇·버전·카카오 채널 정보가 남습니다.</w:t>
+      </w:r>
+    </w:p>
+    <w:p>
+      <w:r>
+        <w:rPr>
+          <w:rFonts w:ascii="Malgun Gothic" w:hAnsi="Malgun Gothic" w:eastAsia="Malgun Gothic"/>
+          <w:b w:val="0"/>
+          <w:i w:val="0"/>
+          <w:sz w:val="21"/>
+        </w:rPr>
+        <w:t>연결에 실패하면 카카오 채널 상태, 챗봇 운영 채널, Skill URL·헤더, 웰컴·폴백 블록, CGA 채널 Provider와 운영 버전을 순서대로 확인합니다. 키나 헤더를 문서에 복사하거나 임의로 변경하지 않습니다.</w:t>
       </w:r>
     </w:p>
     <w:p>

</xml_diff>

<commit_message>
docs: mark pending manual screenshots
</commit_message>
<xml_diff>
--- a/docs/manual/dist/CGA 사용자 설명서.docx
+++ b/docs/manual/dist/CGA 사용자 설명서.docx
@@ -2688,6 +2688,21 @@
     </w:p>
     <w:p>
       <w:pPr>
+        <w:spacing w:before="80" w:after="160"/>
+        <w:ind w:left="288" w:right="288"/>
+      </w:pPr>
+      <w:r>
+        <w:rPr>
+          <w:rFonts w:ascii="Malgun Gothic" w:hAnsi="Malgun Gothic" w:eastAsia="Malgun Gothic"/>
+          <w:i/>
+          <w:color w:val="5F6368"/>
+          <w:sz w:val="19"/>
+        </w:rPr>
+        <w:t>`[화면 캡처 삽입 예정]` Kakao Developers 앱 선택 화면, 카카오 로그인 일반 설정, 비즈 앱 전환, 비즈니스 채널 연결 상태가 보이는 화면을 삽입합니다. 앱 ID·REST API 키·개인정보는 마스킹합니다.</w:t>
+      </w:r>
+    </w:p>
+    <w:p>
+      <w:pPr>
         <w:pStyle w:val="Heading3"/>
       </w:pPr>
       <w:r>
@@ -2763,6 +2778,21 @@
           <w:sz w:val="21"/>
         </w:rPr>
         <w:t>채널 대시보드의 **챗봇 연결하기**에서 운영 채널과 챗봇이 연결되었는지 확인합니다.</w:t>
+      </w:r>
+    </w:p>
+    <w:p>
+      <w:pPr>
+        <w:spacing w:before="80" w:after="160"/>
+        <w:ind w:left="288" w:right="288"/>
+      </w:pPr>
+      <w:r>
+        <w:rPr>
+          <w:rFonts w:ascii="Malgun Gothic" w:hAnsi="Malgun Gothic" w:eastAsia="Malgun Gothic"/>
+          <w:i/>
+          <w:color w:val="5F6368"/>
+          <w:sz w:val="19"/>
+        </w:rPr>
+        <w:t>`[화면 캡처 삽입 예정]` 카카오톡 채널 관리자센터의 채널 상태, 카카오비즈니스 관리센터의 챗봇과 운영 채널 선택 화면을 삽입합니다.</w:t>
       </w:r>
     </w:p>
     <w:p>
@@ -2870,6 +2900,21 @@
     </w:p>
     <w:p>
       <w:pPr>
+        <w:spacing w:before="80" w:after="160"/>
+        <w:ind w:left="288" w:right="288"/>
+      </w:pPr>
+      <w:r>
+        <w:rPr>
+          <w:rFonts w:ascii="Malgun Gothic" w:hAnsi="Malgun Gothic" w:eastAsia="Malgun Gothic"/>
+          <w:i/>
+          <w:color w:val="5F6368"/>
+          <w:sz w:val="19"/>
+        </w:rPr>
+        <w:t>`[화면 캡처 삽입 예정]` 챗봇 관리자센터의 Skill 목록과 Skill 상세 화면(URL·Test URL·헤더·저장 상태)을 삽입합니다. URL과 헤더의 실제 값은 마스킹하거나 빈 값으로 대체합니다.</w:t>
+      </w:r>
+    </w:p>
+    <w:p>
+      <w:pPr>
         <w:pStyle w:val="Heading3"/>
       </w:pPr>
       <w:r>
@@ -3240,6 +3285,96 @@
           <w:sz w:val="21"/>
         </w:rPr>
         <w:t>연결에 실패하면 카카오 채널 상태, 챗봇 운영 채널, Skill URL·헤더, 웰컴·폴백 블록, CGA 채널 Provider와 운영 버전을 순서대로 확인합니다. 키나 헤더를 문서에 복사하거나 임의로 변경하지 않습니다.</w:t>
+      </w:r>
+    </w:p>
+    <w:p>
+      <w:pPr>
+        <w:spacing w:before="80" w:after="160"/>
+        <w:ind w:left="288" w:right="288"/>
+      </w:pPr>
+      <w:r>
+        <w:rPr>
+          <w:rFonts w:ascii="Malgun Gothic" w:hAnsi="Malgun Gothic" w:eastAsia="Malgun Gothic"/>
+          <w:i/>
+          <w:color w:val="5F6368"/>
+          <w:sz w:val="19"/>
+        </w:rPr>
+        <w:t>`[화면 캡처 삽입 예정]` 카카오톡 대화 결과와 CGA 대화 이력에서 채널 값, 봇, 운영 버전, 사용자 발화와 응답이 확인되는 화면을 삽입합니다.</w:t>
+      </w:r>
+    </w:p>
+    <w:p>
+      <w:pPr>
+        <w:pStyle w:val="Heading3"/>
+      </w:pPr>
+      <w:r>
+        <w:rPr>
+          <w:rFonts w:ascii="Malgun Gothic" w:hAnsi="Malgun Gothic" w:eastAsia="Malgun Gothic"/>
+          <w:b/>
+          <w:i w:val="0"/>
+          <w:sz w:val="21"/>
+        </w:rPr>
+        <w:t>6.2.8 CGA 화면 캡처 삽입 위치</w:t>
+      </w:r>
+    </w:p>
+    <w:p>
+      <w:r>
+        <w:rPr>
+          <w:rFonts w:ascii="Malgun Gothic" w:hAnsi="Malgun Gothic" w:eastAsia="Malgun Gothic"/>
+          <w:b w:val="0"/>
+          <w:i w:val="0"/>
+          <w:sz w:val="21"/>
+        </w:rPr>
+        <w:t>다음 CGA 화면은 실제 운영 환경의 권한과 연결 상태를 확인한 뒤 캡처를 삽입합니다.</w:t>
+      </w:r>
+    </w:p>
+    <w:p>
+      <w:pPr>
+        <w:pStyle w:val="ListBullet"/>
+        <w:spacing w:after="80"/>
+      </w:pPr>
+      <w:r>
+        <w:rPr>
+          <w:rFonts w:ascii="Malgun Gothic" w:hAnsi="Malgun Gothic" w:eastAsia="Malgun Gothic"/>
+          <w:sz w:val="21"/>
+        </w:rPr>
+        <w:t>`[화면 캡처 삽입 예정]` **시스템 관리 &gt; 채널 관리**: 채널 아이디, Provider, 렌더러 타입, 사용 여부와 연결 설정</w:t>
+      </w:r>
+    </w:p>
+    <w:p>
+      <w:pPr>
+        <w:pStyle w:val="ListBullet"/>
+        <w:spacing w:after="80"/>
+      </w:pPr>
+      <w:r>
+        <w:rPr>
+          <w:rFonts w:ascii="Malgun Gothic" w:hAnsi="Malgun Gothic" w:eastAsia="Malgun Gothic"/>
+          <w:sz w:val="21"/>
+        </w:rPr>
+        <w:t>`[화면 캡처 삽입 예정]` **봇스테이션 연계 현황**: 그룹, 채널, 봇, 운영 버전, 활성 채널의 연결 상태</w:t>
+      </w:r>
+    </w:p>
+    <w:p>
+      <w:pPr>
+        <w:pStyle w:val="ListBullet"/>
+        <w:spacing w:after="80"/>
+      </w:pPr>
+      <w:r>
+        <w:rPr>
+          <w:rFonts w:ascii="Malgun Gothic" w:hAnsi="Malgun Gothic" w:eastAsia="Malgun Gothic"/>
+          <w:sz w:val="21"/>
+        </w:rPr>
+        <w:t>`[화면 캡처 삽입 예정]` **대화 이력**: 카카오 채널의 사용자 발화, 응답, 봇·버전 정보</w:t>
+      </w:r>
+    </w:p>
+    <w:p>
+      <w:r>
+        <w:rPr>
+          <w:rFonts w:ascii="Malgun Gothic" w:hAnsi="Malgun Gothic" w:eastAsia="Malgun Gothic"/>
+          <w:b w:val="0"/>
+          <w:i w:val="0"/>
+          <w:sz w:val="21"/>
+        </w:rPr>
+        <w:t>캡처를 삽입할 때는 계정명, 앱 ID, REST API 키, Skill URL, 인증 헤더, 개인정보와 같은 민감 정보를 먼저 마스킹합니다.</w:t>
       </w:r>
     </w:p>
     <w:p>

</xml_diff>

<commit_message>
docs: add masked Kakao connection screenshots
</commit_message>
<xml_diff>
--- a/docs/manual/dist/CGA 사용자 설명서.docx
+++ b/docs/manual/dist/CGA 사용자 설명서.docx
@@ -2900,17 +2900,67 @@
     </w:p>
     <w:p>
       <w:pPr>
-        <w:spacing w:before="80" w:after="160"/>
-        <w:ind w:left="288" w:right="288"/>
+        <w:jc w:val="center"/>
+      </w:pPr>
+      <w:r>
+        <w:drawing>
+          <wp:inline xmlns:a="http://schemas.openxmlformats.org/drawingml/2006/main" xmlns:pic="http://schemas.openxmlformats.org/drawingml/2006/picture">
+            <wp:extent cx="5715000" cy="3717346"/>
+            <wp:docPr id="1" name="Picture 1"/>
+            <wp:cNvGraphicFramePr>
+              <a:graphicFrameLocks noChangeAspect="1"/>
+            </wp:cNvGraphicFramePr>
+            <a:graphic>
+              <a:graphicData uri="http://schemas.openxmlformats.org/drawingml/2006/picture">
+                <pic:pic>
+                  <pic:nvPicPr>
+                    <pic:cNvPr id="0" name="kakao-skill-detail-masked.png"/>
+                    <pic:cNvPicPr/>
+                  </pic:nvPicPr>
+                  <pic:blipFill>
+                    <a:blip r:embed="rId11"/>
+                    <a:stretch>
+                      <a:fillRect/>
+                    </a:stretch>
+                  </pic:blipFill>
+                  <pic:spPr>
+                    <a:xfrm>
+                      <a:off x="0" y="0"/>
+                      <a:ext cx="5715000" cy="3717346"/>
+                    </a:xfrm>
+                    <a:prstGeom prst="rect"/>
+                  </pic:spPr>
+                </pic:pic>
+              </a:graphicData>
+            </a:graphic>
+          </wp:inline>
+        </w:drawing>
+      </w:r>
+    </w:p>
+    <w:p>
+      <w:pPr>
+        <w:spacing w:after="160"/>
+        <w:jc w:val="center"/>
       </w:pPr>
       <w:r>
         <w:rPr>
           <w:rFonts w:ascii="Malgun Gothic" w:hAnsi="Malgun Gothic" w:eastAsia="Malgun Gothic"/>
           <w:i/>
           <w:color w:val="5F6368"/>
-          <w:sz w:val="19"/>
+          <w:sz w:val="18"/>
         </w:rPr>
-        <w:t>`[화면 캡처 삽입 예정]` 챗봇 관리자센터의 Skill 목록과 Skill 상세 화면(URL·Test URL·헤더·저장 상태)을 삽입합니다. URL과 헤더의 실제 값은 마스킹하거나 빈 값으로 대체합니다.</w:t>
+        <w:t>카카오 연결 Skill 상세 화면</w:t>
+      </w:r>
+    </w:p>
+    <w:p>
+      <w:r>
+        <w:rPr>
+          <w:rFonts w:ascii="Malgun Gothic" w:hAnsi="Malgun Gothic" w:eastAsia="Malgun Gothic"/>
+          <w:b w:val="0"/>
+          <w:i w:val="0"/>
+          <w:sz w:val="21"/>
+        </w:rPr>
+        <w:t>그림 6-2-1. `Aidot 카카오 연결` Skill 상세 화면. URL과 헤더 값은 보안을 위해 마스킹했습니다.</w:t>
       </w:r>
     </w:p>
     <w:p>
@@ -3014,6 +3064,136 @@
           <w:sz w:val="21"/>
         </w:rPr>
         <w:t>웰컴 블록은 카카오톡 대화의 첫 진입을 처리하고, 폴백 블록은 일반 발화를 CGA로 전달합니다. 두 블록이 서로 다른 Skill이나 다른 운영 버전을 사용하면 첫 인사말과 일반 응답의 처리 결과가 달라질 수 있습니다.</w:t>
+      </w:r>
+    </w:p>
+    <w:p>
+      <w:pPr>
+        <w:jc w:val="center"/>
+      </w:pPr>
+      <w:r>
+        <w:drawing>
+          <wp:inline xmlns:a="http://schemas.openxmlformats.org/drawingml/2006/main" xmlns:pic="http://schemas.openxmlformats.org/drawingml/2006/picture">
+            <wp:extent cx="5715000" cy="3724928"/>
+            <wp:docPr id="2" name="Picture 2"/>
+            <wp:cNvGraphicFramePr>
+              <a:graphicFrameLocks noChangeAspect="1"/>
+            </wp:cNvGraphicFramePr>
+            <a:graphic>
+              <a:graphicData uri="http://schemas.openxmlformats.org/drawingml/2006/picture">
+                <pic:pic>
+                  <pic:nvPicPr>
+                    <pic:cNvPr id="0" name="kakao-welcome-block.png"/>
+                    <pic:cNvPicPr/>
+                  </pic:nvPicPr>
+                  <pic:blipFill>
+                    <a:blip r:embed="rId12"/>
+                    <a:stretch>
+                      <a:fillRect/>
+                    </a:stretch>
+                  </pic:blipFill>
+                  <pic:spPr>
+                    <a:xfrm>
+                      <a:off x="0" y="0"/>
+                      <a:ext cx="5715000" cy="3724928"/>
+                    </a:xfrm>
+                    <a:prstGeom prst="rect"/>
+                  </pic:spPr>
+                </pic:pic>
+              </a:graphicData>
+            </a:graphic>
+          </wp:inline>
+        </w:drawing>
+      </w:r>
+    </w:p>
+    <w:p>
+      <w:pPr>
+        <w:spacing w:after="160"/>
+        <w:jc w:val="center"/>
+      </w:pPr>
+      <w:r>
+        <w:rPr>
+          <w:rFonts w:ascii="Malgun Gothic" w:hAnsi="Malgun Gothic" w:eastAsia="Malgun Gothic"/>
+          <w:i/>
+          <w:color w:val="5F6368"/>
+          <w:sz w:val="18"/>
+        </w:rPr>
+        <w:t>카카오 웰컴 블록</w:t>
+      </w:r>
+    </w:p>
+    <w:p>
+      <w:r>
+        <w:rPr>
+          <w:rFonts w:ascii="Malgun Gothic" w:hAnsi="Malgun Gothic" w:eastAsia="Malgun Gothic"/>
+          <w:b w:val="0"/>
+          <w:i w:val="0"/>
+          <w:sz w:val="21"/>
+        </w:rPr>
+        <w:t>그림 6-2-2. 웰컴 블록의 파라미터 설정과 스킬데이터 사용 화면.</w:t>
+      </w:r>
+    </w:p>
+    <w:p>
+      <w:pPr>
+        <w:jc w:val="center"/>
+      </w:pPr>
+      <w:r>
+        <w:drawing>
+          <wp:inline xmlns:a="http://schemas.openxmlformats.org/drawingml/2006/main" xmlns:pic="http://schemas.openxmlformats.org/drawingml/2006/picture">
+            <wp:extent cx="5715000" cy="3755136"/>
+            <wp:docPr id="3" name="Picture 3"/>
+            <wp:cNvGraphicFramePr>
+              <a:graphicFrameLocks noChangeAspect="1"/>
+            </wp:cNvGraphicFramePr>
+            <a:graphic>
+              <a:graphicData uri="http://schemas.openxmlformats.org/drawingml/2006/picture">
+                <pic:pic>
+                  <pic:nvPicPr>
+                    <pic:cNvPr id="0" name="kakao-fallback-block.png"/>
+                    <pic:cNvPicPr/>
+                  </pic:nvPicPr>
+                  <pic:blipFill>
+                    <a:blip r:embed="rId13"/>
+                    <a:stretch>
+                      <a:fillRect/>
+                    </a:stretch>
+                  </pic:blipFill>
+                  <pic:spPr>
+                    <a:xfrm>
+                      <a:off x="0" y="0"/>
+                      <a:ext cx="5715000" cy="3755136"/>
+                    </a:xfrm>
+                    <a:prstGeom prst="rect"/>
+                  </pic:spPr>
+                </pic:pic>
+              </a:graphicData>
+            </a:graphic>
+          </wp:inline>
+        </w:drawing>
+      </w:r>
+    </w:p>
+    <w:p>
+      <w:pPr>
+        <w:spacing w:after="160"/>
+        <w:jc w:val="center"/>
+      </w:pPr>
+      <w:r>
+        <w:rPr>
+          <w:rFonts w:ascii="Malgun Gothic" w:hAnsi="Malgun Gothic" w:eastAsia="Malgun Gothic"/>
+          <w:i/>
+          <w:color w:val="5F6368"/>
+          <w:sz w:val="18"/>
+        </w:rPr>
+        <w:t>카카오 폴백 블록</w:t>
+      </w:r>
+    </w:p>
+    <w:p>
+      <w:r>
+        <w:rPr>
+          <w:rFonts w:ascii="Malgun Gothic" w:hAnsi="Malgun Gothic" w:eastAsia="Malgun Gothic"/>
+          <w:b w:val="0"/>
+          <w:i w:val="0"/>
+          <w:sz w:val="21"/>
+        </w:rPr>
+        <w:t>그림 6-2-3. 폴백 블록의 파라미터 설정과 스킬데이터 사용 화면.</w:t>
       </w:r>
     </w:p>
     <w:p>

</xml_diff>

<commit_message>
feat: publish seven-language CGA manuals
</commit_message>
<xml_diff>
--- a/docs/manual/dist/CGA 사용자 설명서.docx
+++ b/docs/manual/dist/CGA 사용자 설명서.docx
@@ -2688,21 +2688,6 @@
     </w:p>
     <w:p>
       <w:pPr>
-        <w:spacing w:before="80" w:after="160"/>
-        <w:ind w:left="288" w:right="288"/>
-      </w:pPr>
-      <w:r>
-        <w:rPr>
-          <w:rFonts w:ascii="Malgun Gothic" w:hAnsi="Malgun Gothic" w:eastAsia="Malgun Gothic"/>
-          <w:i/>
-          <w:color w:val="5F6368"/>
-          <w:sz w:val="19"/>
-        </w:rPr>
-        <w:t>`[화면 캡처 삽입 예정]` Kakao Developers 앱 선택 화면, 카카오 로그인 일반 설정, 비즈 앱 전환, 비즈니스 채널 연결 상태가 보이는 화면을 삽입합니다. 앱 ID·REST API 키·개인정보는 마스킹합니다.</w:t>
-      </w:r>
-    </w:p>
-    <w:p>
-      <w:pPr>
         <w:pStyle w:val="Heading3"/>
       </w:pPr>
       <w:r>
@@ -2778,21 +2763,6 @@
           <w:sz w:val="21"/>
         </w:rPr>
         <w:t>채널 대시보드의 **챗봇 연결하기**에서 운영 채널과 챗봇이 연결되었는지 확인합니다.</w:t>
-      </w:r>
-    </w:p>
-    <w:p>
-      <w:pPr>
-        <w:spacing w:before="80" w:after="160"/>
-        <w:ind w:left="288" w:right="288"/>
-      </w:pPr>
-      <w:r>
-        <w:rPr>
-          <w:rFonts w:ascii="Malgun Gothic" w:hAnsi="Malgun Gothic" w:eastAsia="Malgun Gothic"/>
-          <w:i/>
-          <w:color w:val="5F6368"/>
-          <w:sz w:val="19"/>
-        </w:rPr>
-        <w:t>`[화면 캡처 삽입 예정]` 카카오톡 채널 관리자센터의 채널 상태, 카카오비즈니스 관리센터의 챗봇과 운영 채널 선택 화면을 삽입합니다.</w:t>
       </w:r>
     </w:p>
     <w:p>
@@ -3469,21 +3439,6 @@
     </w:p>
     <w:p>
       <w:pPr>
-        <w:spacing w:before="80" w:after="160"/>
-        <w:ind w:left="288" w:right="288"/>
-      </w:pPr>
-      <w:r>
-        <w:rPr>
-          <w:rFonts w:ascii="Malgun Gothic" w:hAnsi="Malgun Gothic" w:eastAsia="Malgun Gothic"/>
-          <w:i/>
-          <w:color w:val="5F6368"/>
-          <w:sz w:val="19"/>
-        </w:rPr>
-        <w:t>`[화면 캡처 삽입 예정]` 카카오톡 대화 결과와 CGA 대화 이력에서 채널 값, 봇, 운영 버전, 사용자 발화와 응답이 확인되는 화면을 삽입합니다.</w:t>
-      </w:r>
-    </w:p>
-    <w:p>
-      <w:pPr>
         <w:pStyle w:val="Heading3"/>
       </w:pPr>
       <w:r>
@@ -3505,45 +3460,6 @@
           <w:sz w:val="21"/>
         </w:rPr>
         <w:t>다음 CGA 화면은 실제 운영 환경의 권한과 연결 상태를 확인한 뒤 캡처를 삽입합니다.</w:t>
-      </w:r>
-    </w:p>
-    <w:p>
-      <w:pPr>
-        <w:pStyle w:val="ListBullet"/>
-        <w:spacing w:after="80"/>
-      </w:pPr>
-      <w:r>
-        <w:rPr>
-          <w:rFonts w:ascii="Malgun Gothic" w:hAnsi="Malgun Gothic" w:eastAsia="Malgun Gothic"/>
-          <w:sz w:val="21"/>
-        </w:rPr>
-        <w:t>`[화면 캡처 삽입 예정]` **시스템 관리 &gt; 채널 관리**: 채널 아이디, Provider, 렌더러 타입, 사용 여부와 연결 설정</w:t>
-      </w:r>
-    </w:p>
-    <w:p>
-      <w:pPr>
-        <w:pStyle w:val="ListBullet"/>
-        <w:spacing w:after="80"/>
-      </w:pPr>
-      <w:r>
-        <w:rPr>
-          <w:rFonts w:ascii="Malgun Gothic" w:hAnsi="Malgun Gothic" w:eastAsia="Malgun Gothic"/>
-          <w:sz w:val="21"/>
-        </w:rPr>
-        <w:t>`[화면 캡처 삽입 예정]` **봇스테이션 연계 현황**: 그룹, 채널, 봇, 운영 버전, 활성 채널의 연결 상태</w:t>
-      </w:r>
-    </w:p>
-    <w:p>
-      <w:pPr>
-        <w:pStyle w:val="ListBullet"/>
-        <w:spacing w:after="80"/>
-      </w:pPr>
-      <w:r>
-        <w:rPr>
-          <w:rFonts w:ascii="Malgun Gothic" w:hAnsi="Malgun Gothic" w:eastAsia="Malgun Gothic"/>
-          <w:sz w:val="21"/>
-        </w:rPr>
-        <w:t>`[화면 캡처 삽입 예정]` **대화 이력**: 카카오 채널의 사용자 발화, 응답, 봇·버전 정보</w:t>
       </w:r>
     </w:p>
     <w:p>

</xml_diff>